<commit_message>
feat(project): consolida base documental y tooling plaza mayor
</commit_message>
<xml_diff>
--- a/DOCS - ANEJOS/1.- Reportaje Fotografico/Anexo 1 - Reportaje Fotografico.docx
+++ b/DOCS - ANEJOS/1.- Reportaje Fotografico/Anexo 1 - Reportaje Fotografico.docx
@@ -18,7 +18,7 @@
           <w:sz w:val="24"/>
           <w:szCs w:val="24"/>
         </w:rPr>
-        <w:t>ANEJO N.º XX.– [TÍTULO DEL ANEJO]</w:t>
+        <w:t xml:space="preserve">ANEJO 1. REPORTAJE FOTOGRÁFICO</w:t>
       </w:r>
     </w:p>
     <w:p>
@@ -52,8 +52,7 @@
           <w:color w:val="0070C0"/>
           <w:sz w:val="20"/>
         </w:rPr>
-        <w:lastRenderedPageBreak/>
-        <w:t xml:space="preserve">PROYECTO ORDINARIO DE URBANIZACIÓN </w:t>
+        <w:t xml:space="preserve">PROYECTO DE URBANIZACIÓN</w:t>
       </w:r>
     </w:p>
     <w:p>
@@ -79,7 +78,7 @@
           <w:szCs w:val="24"/>
           <w:lang w:val="es-ES_tradnl"/>
         </w:rPr>
-        <w:t>AMPLIACION PLAZA MAYOR, MALAGA</w:t>
+        <w:t xml:space="preserve">AMPLIACIÓN PLAZA MAYOR, MÁLAGA</w:t>
       </w:r>
     </w:p>
     <w:p>
@@ -92,7 +91,7 @@
           <w:b/>
           <w:bCs/>
         </w:rPr>
-        <w:t>ANEJO N.º XX.– [TÍTULO DEL ANEJO]</w:t>
+        <w:t xml:space="preserve">ANEJO 1. REPORTAJE FOTOGRÁFICO</w:t>
       </w:r>
     </w:p>
     <w:p>
@@ -108,30 +107,23 @@
         <w:t>ÍNDICE</w:t>
       </w:r>
     </w:p>
-    <w:sdt>
+    <w:sdt xmlns:w="http://schemas.openxmlformats.org/wordprocessingml/2006/main">
       <w:sdtPr>
         <w:id w:val="1777975262"/>
       </w:sdtPr>
-      <w:sdtEndPr/>
       <w:sdtContent>
-        <w:p>
+        <w:p xmlns:w14="http://schemas.microsoft.com/office/word/2010/wordml">
           <w:pPr>
             <w:pStyle w:val="TDC2"/>
             <w:tabs>
               <w:tab w:val="right" w:leader="dot" w:pos="9062"/>
             </w:tabs>
             <w:rPr>
-              <w:rFonts w:asciiTheme="minorHAnsi" w:eastAsiaTheme="minorEastAsia" w:hAnsiTheme="minorHAnsi" w:cstheme="minorBidi"/>
               <w:noProof/>
-              <w:color w:val="auto"/>
-              <w:kern w:val="2"/>
-              <w:sz w:val="24"/>
-              <w:szCs w:val="24"/>
-              <w14:ligatures w14:val="standardContextual"/>
             </w:rPr>
           </w:pPr>
           <w:r>
-            <w:fldChar w:fldCharType="begin"/>
+            <w:fldChar w:fldCharType="begin" w:dirty="true"/>
           </w:r>
           <w:r>
             <w:instrText>TOC \h \o "1-4"</w:instrText>
@@ -139,7 +131,7 @@
           <w:r>
             <w:fldChar w:fldCharType="separate"/>
           </w:r>
-          <w:hyperlink w:anchor="_Toc227163362" w:history="1">
+          <w:hyperlink w:anchor="_TocPM000001" w:history="1">
             <w:r>
               <w:rPr>
                 <w:rStyle w:val="Hipervnculo"/>
@@ -157,13 +149,13 @@
               <w:rPr>
                 <w:noProof/>
               </w:rPr>
-              <w:fldChar w:fldCharType="begin"/>
+              <w:fldChar w:fldCharType="begin" w:dirty="true"/>
             </w:r>
             <w:r>
               <w:rPr>
                 <w:noProof/>
               </w:rPr>
-              <w:instrText xml:space="preserve"> PAGEREF _Toc227163362 \h </w:instrText>
+              <w:instrText xml:space="preserve"> PAGEREF _TocPM000001 \h </w:instrText>
             </w:r>
             <w:r>
               <w:rPr>
@@ -180,7 +172,7 @@
               <w:rPr>
                 <w:noProof/>
               </w:rPr>
-              <w:t>3</w:t>
+              <w:t>1</w:t>
             </w:r>
             <w:r>
               <w:rPr>
@@ -190,29 +182,23 @@
             </w:r>
           </w:hyperlink>
         </w:p>
-        <w:p>
+        <w:p xmlns:w14="http://schemas.microsoft.com/office/word/2010/wordml">
           <w:pPr>
             <w:pStyle w:val="TDC2"/>
             <w:tabs>
               <w:tab w:val="right" w:leader="dot" w:pos="9062"/>
             </w:tabs>
             <w:rPr>
-              <w:rFonts w:asciiTheme="minorHAnsi" w:eastAsiaTheme="minorEastAsia" w:hAnsiTheme="minorHAnsi" w:cstheme="minorBidi"/>
               <w:noProof/>
-              <w:color w:val="auto"/>
-              <w:kern w:val="2"/>
-              <w:sz w:val="24"/>
-              <w:szCs w:val="24"/>
-              <w14:ligatures w14:val="standardContextual"/>
             </w:rPr>
           </w:pPr>
-          <w:hyperlink w:anchor="_Toc227163363" w:history="1">
+          <w:hyperlink w:anchor="_TocPM000002" w:history="1">
             <w:r>
               <w:rPr>
                 <w:rStyle w:val="Hipervnculo"/>
                 <w:noProof/>
               </w:rPr>
-              <w:t>2. ANTECEDENTES / INFORMACIÓN DE PARTIDA</w:t>
+              <w:t>2. REPORTAJE FOTOGRÁFICO</w:t>
             </w:r>
             <w:r>
               <w:rPr>
@@ -224,13 +210,13 @@
               <w:rPr>
                 <w:noProof/>
               </w:rPr>
-              <w:fldChar w:fldCharType="begin"/>
+              <w:fldChar w:fldCharType="begin" w:dirty="true"/>
             </w:r>
             <w:r>
               <w:rPr>
                 <w:noProof/>
               </w:rPr>
-              <w:instrText xml:space="preserve"> PAGEREF _Toc227163363 \h </w:instrText>
+              <w:instrText xml:space="preserve"> PAGEREF _TocPM000002 \h </w:instrText>
             </w:r>
             <w:r>
               <w:rPr>
@@ -247,7 +233,7 @@
               <w:rPr>
                 <w:noProof/>
               </w:rPr>
-              <w:t>3</w:t>
+              <w:t>1</w:t>
             </w:r>
             <w:r>
               <w:rPr>
@@ -257,559 +243,23 @@
             </w:r>
           </w:hyperlink>
         </w:p>
-        <w:p>
-          <w:pPr>
-            <w:pStyle w:val="TDC2"/>
-            <w:tabs>
-              <w:tab w:val="right" w:leader="dot" w:pos="9062"/>
-            </w:tabs>
-            <w:rPr>
-              <w:rFonts w:asciiTheme="minorHAnsi" w:eastAsiaTheme="minorEastAsia" w:hAnsiTheme="minorHAnsi" w:cstheme="minorBidi"/>
-              <w:noProof/>
-              <w:color w:val="auto"/>
-              <w:kern w:val="2"/>
-              <w:sz w:val="24"/>
-              <w:szCs w:val="24"/>
-              <w14:ligatures w14:val="standardContextual"/>
-            </w:rPr>
-          </w:pPr>
-          <w:hyperlink w:anchor="_Toc227163364" w:history="1">
-            <w:r>
-              <w:rPr>
-                <w:rStyle w:val="Hipervnculo"/>
-                <w:noProof/>
-              </w:rPr>
-              <w:t>3. DESCRIPCIÓN / CRITERIOS / SOLUCIÓN ADOPTADA</w:t>
-            </w:r>
-            <w:r>
-              <w:rPr>
-                <w:noProof/>
-              </w:rPr>
-              <w:tab/>
-            </w:r>
-            <w:r>
-              <w:rPr>
-                <w:noProof/>
-              </w:rPr>
-              <w:fldChar w:fldCharType="begin"/>
-            </w:r>
-            <w:r>
-              <w:rPr>
-                <w:noProof/>
-              </w:rPr>
-              <w:instrText xml:space="preserve"> PAGEREF _Toc227163364 \h </w:instrText>
-            </w:r>
-            <w:r>
-              <w:rPr>
-                <w:noProof/>
-              </w:rPr>
-            </w:r>
-            <w:r>
-              <w:rPr>
-                <w:noProof/>
-              </w:rPr>
-              <w:fldChar w:fldCharType="separate"/>
-            </w:r>
-            <w:r>
-              <w:rPr>
-                <w:noProof/>
-              </w:rPr>
-              <w:t>3</w:t>
-            </w:r>
-            <w:r>
-              <w:rPr>
-                <w:noProof/>
-              </w:rPr>
-              <w:fldChar w:fldCharType="end"/>
-            </w:r>
-          </w:hyperlink>
-        </w:p>
-        <w:p>
-          <w:pPr>
-            <w:pStyle w:val="TDC3"/>
-            <w:tabs>
-              <w:tab w:val="right" w:leader="dot" w:pos="9062"/>
-            </w:tabs>
-            <w:rPr>
-              <w:rFonts w:asciiTheme="minorHAnsi" w:eastAsiaTheme="minorEastAsia" w:hAnsiTheme="minorHAnsi" w:cstheme="minorBidi"/>
-              <w:noProof/>
-              <w:color w:val="auto"/>
-              <w:kern w:val="2"/>
-              <w:sz w:val="24"/>
-              <w:szCs w:val="24"/>
-              <w14:ligatures w14:val="standardContextual"/>
-            </w:rPr>
-          </w:pPr>
-          <w:hyperlink w:anchor="_Toc227163365" w:history="1">
-            <w:r>
-              <w:rPr>
-                <w:rStyle w:val="Hipervnculo"/>
-                <w:noProof/>
-              </w:rPr>
-              <w:t>3.1. Documentacion de partida</w:t>
-            </w:r>
-            <w:r>
-              <w:rPr>
-                <w:noProof/>
-              </w:rPr>
-              <w:tab/>
-            </w:r>
-            <w:r>
-              <w:rPr>
-                <w:noProof/>
-              </w:rPr>
-              <w:fldChar w:fldCharType="begin"/>
-            </w:r>
-            <w:r>
-              <w:rPr>
-                <w:noProof/>
-              </w:rPr>
-              <w:instrText xml:space="preserve"> PAGEREF _Toc227163365 \h </w:instrText>
-            </w:r>
-            <w:r>
-              <w:rPr>
-                <w:noProof/>
-              </w:rPr>
-            </w:r>
-            <w:r>
-              <w:rPr>
-                <w:noProof/>
-              </w:rPr>
-              <w:fldChar w:fldCharType="separate"/>
-            </w:r>
-            <w:r>
-              <w:rPr>
-                <w:noProof/>
-              </w:rPr>
-              <w:t>3</w:t>
-            </w:r>
-            <w:r>
-              <w:rPr>
-                <w:noProof/>
-              </w:rPr>
-              <w:fldChar w:fldCharType="end"/>
-            </w:r>
-          </w:hyperlink>
-        </w:p>
-        <w:p>
-          <w:pPr>
-            <w:pStyle w:val="TDC3"/>
-            <w:tabs>
-              <w:tab w:val="right" w:leader="dot" w:pos="9062"/>
-            </w:tabs>
-            <w:rPr>
-              <w:rFonts w:asciiTheme="minorHAnsi" w:eastAsiaTheme="minorEastAsia" w:hAnsiTheme="minorHAnsi" w:cstheme="minorBidi"/>
-              <w:noProof/>
-              <w:color w:val="auto"/>
-              <w:kern w:val="2"/>
-              <w:sz w:val="24"/>
-              <w:szCs w:val="24"/>
-              <w14:ligatures w14:val="standardContextual"/>
-            </w:rPr>
-          </w:pPr>
-          <w:hyperlink w:anchor="_Toc227163366" w:history="1">
-            <w:r>
-              <w:rPr>
-                <w:rStyle w:val="Hipervnculo"/>
-                <w:noProof/>
-              </w:rPr>
-              <w:t>3.2. Criterios de adaptacion</w:t>
-            </w:r>
-            <w:r>
-              <w:rPr>
-                <w:noProof/>
-              </w:rPr>
-              <w:tab/>
-            </w:r>
-            <w:r>
-              <w:rPr>
-                <w:noProof/>
-              </w:rPr>
-              <w:fldChar w:fldCharType="begin"/>
-            </w:r>
-            <w:r>
-              <w:rPr>
-                <w:noProof/>
-              </w:rPr>
-              <w:instrText xml:space="preserve"> PAGEREF _Toc227163366 \h </w:instrText>
-            </w:r>
-            <w:r>
-              <w:rPr>
-                <w:noProof/>
-              </w:rPr>
-            </w:r>
-            <w:r>
-              <w:rPr>
-                <w:noProof/>
-              </w:rPr>
-              <w:fldChar w:fldCharType="separate"/>
-            </w:r>
-            <w:r>
-              <w:rPr>
-                <w:noProof/>
-              </w:rPr>
-              <w:t>3</w:t>
-            </w:r>
-            <w:r>
-              <w:rPr>
-                <w:noProof/>
-              </w:rPr>
-              <w:fldChar w:fldCharType="end"/>
-            </w:r>
-          </w:hyperlink>
-        </w:p>
-        <w:p>
-          <w:pPr>
-            <w:pStyle w:val="TDC4"/>
-            <w:tabs>
-              <w:tab w:val="right" w:leader="dot" w:pos="9062"/>
-            </w:tabs>
-            <w:rPr>
-              <w:rFonts w:asciiTheme="minorHAnsi" w:eastAsiaTheme="minorEastAsia" w:hAnsiTheme="minorHAnsi" w:cstheme="minorBidi"/>
-              <w:noProof/>
-              <w:color w:val="auto"/>
-              <w:kern w:val="2"/>
-              <w:sz w:val="24"/>
-              <w:szCs w:val="24"/>
-              <w14:ligatures w14:val="standardContextual"/>
-            </w:rPr>
-          </w:pPr>
-          <w:hyperlink w:anchor="_Toc227163367" w:history="1">
-            <w:r>
-              <w:rPr>
-                <w:rStyle w:val="Hipervnculo"/>
-                <w:noProof/>
-              </w:rPr>
-              <w:t>3.2.1. Trabajos pendientes</w:t>
-            </w:r>
-            <w:r>
-              <w:rPr>
-                <w:noProof/>
-              </w:rPr>
-              <w:tab/>
-            </w:r>
-            <w:r>
-              <w:rPr>
-                <w:noProof/>
-              </w:rPr>
-              <w:fldChar w:fldCharType="begin"/>
-            </w:r>
-            <w:r>
-              <w:rPr>
-                <w:noProof/>
-              </w:rPr>
-              <w:instrText xml:space="preserve"> PAGEREF _Toc227163367 \h </w:instrText>
-            </w:r>
-            <w:r>
-              <w:rPr>
-                <w:noProof/>
-              </w:rPr>
-            </w:r>
-            <w:r>
-              <w:rPr>
-                <w:noProof/>
-              </w:rPr>
-              <w:fldChar w:fldCharType="separate"/>
-            </w:r>
-            <w:r>
-              <w:rPr>
-                <w:noProof/>
-              </w:rPr>
-              <w:t>3</w:t>
-            </w:r>
-            <w:r>
-              <w:rPr>
-                <w:noProof/>
-              </w:rPr>
-              <w:fldChar w:fldCharType="end"/>
-            </w:r>
-          </w:hyperlink>
-        </w:p>
-        <w:p>
-          <w:pPr>
-            <w:pStyle w:val="TDC2"/>
-            <w:tabs>
-              <w:tab w:val="right" w:leader="dot" w:pos="9062"/>
-            </w:tabs>
-            <w:rPr>
-              <w:rFonts w:asciiTheme="minorHAnsi" w:eastAsiaTheme="minorEastAsia" w:hAnsiTheme="minorHAnsi" w:cstheme="minorBidi"/>
-              <w:noProof/>
-              <w:color w:val="auto"/>
-              <w:kern w:val="2"/>
-              <w:sz w:val="24"/>
-              <w:szCs w:val="24"/>
-              <w14:ligatures w14:val="standardContextual"/>
-            </w:rPr>
-          </w:pPr>
-          <w:hyperlink w:anchor="_Toc227163368" w:history="1">
-            <w:r>
-              <w:rPr>
-                <w:rStyle w:val="Hipervnculo"/>
-                <w:noProof/>
-              </w:rPr>
-              <w:t>4. JUSTIFICACIÓN / CÁLCULOS / DESARROLLO</w:t>
-            </w:r>
-            <w:r>
-              <w:rPr>
-                <w:noProof/>
-              </w:rPr>
-              <w:tab/>
-            </w:r>
-            <w:r>
-              <w:rPr>
-                <w:noProof/>
-              </w:rPr>
-              <w:fldChar w:fldCharType="begin"/>
-            </w:r>
-            <w:r>
-              <w:rPr>
-                <w:noProof/>
-              </w:rPr>
-              <w:instrText xml:space="preserve"> PAGEREF _Toc227163368 \h </w:instrText>
-            </w:r>
-            <w:r>
-              <w:rPr>
-                <w:noProof/>
-              </w:rPr>
-            </w:r>
-            <w:r>
-              <w:rPr>
-                <w:noProof/>
-              </w:rPr>
-              <w:fldChar w:fldCharType="separate"/>
-            </w:r>
-            <w:r>
-              <w:rPr>
-                <w:noProof/>
-              </w:rPr>
-              <w:t>4</w:t>
-            </w:r>
-            <w:r>
-              <w:rPr>
-                <w:noProof/>
-              </w:rPr>
-              <w:fldChar w:fldCharType="end"/>
-            </w:r>
-          </w:hyperlink>
-        </w:p>
-        <w:p>
-          <w:pPr>
-            <w:pStyle w:val="TDC3"/>
-            <w:tabs>
-              <w:tab w:val="right" w:leader="dot" w:pos="9062"/>
-            </w:tabs>
-            <w:rPr>
-              <w:rFonts w:asciiTheme="minorHAnsi" w:eastAsiaTheme="minorEastAsia" w:hAnsiTheme="minorHAnsi" w:cstheme="minorBidi"/>
-              <w:noProof/>
-              <w:color w:val="auto"/>
-              <w:kern w:val="2"/>
-              <w:sz w:val="24"/>
-              <w:szCs w:val="24"/>
-              <w14:ligatures w14:val="standardContextual"/>
-            </w:rPr>
-          </w:pPr>
-          <w:hyperlink w:anchor="_Toc227163369" w:history="1">
-            <w:r>
-              <w:rPr>
-                <w:rStyle w:val="Hipervnculo"/>
-                <w:noProof/>
-              </w:rPr>
-              <w:t>4.1. [Primer subapartado de cálculo]</w:t>
-            </w:r>
-            <w:r>
-              <w:rPr>
-                <w:noProof/>
-              </w:rPr>
-              <w:tab/>
-            </w:r>
-            <w:r>
-              <w:rPr>
-                <w:noProof/>
-              </w:rPr>
-              <w:fldChar w:fldCharType="begin"/>
-            </w:r>
-            <w:r>
-              <w:rPr>
-                <w:noProof/>
-              </w:rPr>
-              <w:instrText xml:space="preserve"> PAGEREF _Toc227163369 \h </w:instrText>
-            </w:r>
-            <w:r>
-              <w:rPr>
-                <w:noProof/>
-              </w:rPr>
-            </w:r>
-            <w:r>
-              <w:rPr>
-                <w:noProof/>
-              </w:rPr>
-              <w:fldChar w:fldCharType="separate"/>
-            </w:r>
-            <w:r>
-              <w:rPr>
-                <w:noProof/>
-              </w:rPr>
-              <w:t>4</w:t>
-            </w:r>
-            <w:r>
-              <w:rPr>
-                <w:noProof/>
-              </w:rPr>
-              <w:fldChar w:fldCharType="end"/>
-            </w:r>
-          </w:hyperlink>
-        </w:p>
-        <w:p>
-          <w:pPr>
-            <w:pStyle w:val="TDC3"/>
-            <w:tabs>
-              <w:tab w:val="right" w:leader="dot" w:pos="9062"/>
-            </w:tabs>
-            <w:rPr>
-              <w:rFonts w:asciiTheme="minorHAnsi" w:eastAsiaTheme="minorEastAsia" w:hAnsiTheme="minorHAnsi" w:cstheme="minorBidi"/>
-              <w:noProof/>
-              <w:color w:val="auto"/>
-              <w:kern w:val="2"/>
-              <w:sz w:val="24"/>
-              <w:szCs w:val="24"/>
-              <w14:ligatures w14:val="standardContextual"/>
-            </w:rPr>
-          </w:pPr>
-          <w:hyperlink w:anchor="_Toc227163370" w:history="1">
-            <w:r>
-              <w:rPr>
-                <w:rStyle w:val="Hipervnculo"/>
-                <w:noProof/>
-              </w:rPr>
-              <w:t>4.2. [Segundo subapartado de cálculo]</w:t>
-            </w:r>
-            <w:r>
-              <w:rPr>
-                <w:noProof/>
-              </w:rPr>
-              <w:tab/>
-            </w:r>
-            <w:r>
-              <w:rPr>
-                <w:noProof/>
-              </w:rPr>
-              <w:fldChar w:fldCharType="begin"/>
-            </w:r>
-            <w:r>
-              <w:rPr>
-                <w:noProof/>
-              </w:rPr>
-              <w:instrText xml:space="preserve"> PAGEREF _Toc227163370 \h </w:instrText>
-            </w:r>
-            <w:r>
-              <w:rPr>
-                <w:noProof/>
-              </w:rPr>
-            </w:r>
-            <w:r>
-              <w:rPr>
-                <w:noProof/>
-              </w:rPr>
-              <w:fldChar w:fldCharType="separate"/>
-            </w:r>
-            <w:r>
-              <w:rPr>
-                <w:noProof/>
-              </w:rPr>
-              <w:t>4</w:t>
-            </w:r>
-            <w:r>
-              <w:rPr>
-                <w:noProof/>
-              </w:rPr>
-              <w:fldChar w:fldCharType="end"/>
-            </w:r>
-          </w:hyperlink>
-        </w:p>
-        <w:p>
-          <w:pPr>
-            <w:pStyle w:val="TDC2"/>
-            <w:tabs>
-              <w:tab w:val="right" w:leader="dot" w:pos="9062"/>
-            </w:tabs>
-            <w:rPr>
-              <w:rFonts w:asciiTheme="minorHAnsi" w:eastAsiaTheme="minorEastAsia" w:hAnsiTheme="minorHAnsi" w:cstheme="minorBidi"/>
-              <w:noProof/>
-              <w:color w:val="auto"/>
-              <w:kern w:val="2"/>
-              <w:sz w:val="24"/>
-              <w:szCs w:val="24"/>
-              <w14:ligatures w14:val="standardContextual"/>
-            </w:rPr>
-          </w:pPr>
-          <w:hyperlink w:anchor="_Toc227163371" w:history="1">
-            <w:r>
-              <w:rPr>
-                <w:rStyle w:val="Hipervnculo"/>
-                <w:noProof/>
-              </w:rPr>
-              <w:t>5. CONCLUSIONES</w:t>
-            </w:r>
-            <w:r>
-              <w:rPr>
-                <w:noProof/>
-              </w:rPr>
-              <w:tab/>
-            </w:r>
-            <w:r>
-              <w:rPr>
-                <w:noProof/>
-              </w:rPr>
-              <w:fldChar w:fldCharType="begin"/>
-            </w:r>
-            <w:r>
-              <w:rPr>
-                <w:noProof/>
-              </w:rPr>
-              <w:instrText xml:space="preserve"> PAGEREF _Toc227163371 \h </w:instrText>
-            </w:r>
-            <w:r>
-              <w:rPr>
-                <w:noProof/>
-              </w:rPr>
-            </w:r>
-            <w:r>
-              <w:rPr>
-                <w:noProof/>
-              </w:rPr>
-              <w:fldChar w:fldCharType="separate"/>
-            </w:r>
-            <w:r>
-              <w:rPr>
-                <w:noProof/>
-              </w:rPr>
-              <w:t>4</w:t>
-            </w:r>
-            <w:r>
-              <w:rPr>
-                <w:noProof/>
-              </w:rPr>
-              <w:fldChar w:fldCharType="end"/>
-            </w:r>
-          </w:hyperlink>
-        </w:p>
-        <w:p>
+        <w:p xmlns:w14="http://schemas.microsoft.com/office/word/2010/wordml">
           <w:r>
             <w:fldChar w:fldCharType="end"/>
           </w:r>
         </w:p>
       </w:sdtContent>
     </w:sdt>
-    <w:p>
+    <w:p xmlns:w14="http://schemas.microsoft.com/office/word/2010/wordml" xmlns:w="http://schemas.openxmlformats.org/wordprocessingml/2006/main">
       <w:r>
         <w:br w:type="page"/>
       </w:r>
     </w:p>
-    <w:p>
+    <w:p xmlns:w14="http://schemas.microsoft.com/office/word/2010/wordml" xmlns:w="http://schemas.openxmlformats.org/wordprocessingml/2006/main">
       <w:pPr>
         <w:sectPr>
-          <w:headerReference w:type="default" r:id="rId8"/>
-          <w:footerReference w:type="default" r:id="rId9"/>
+          <w:headerReference xmlns:r="http://schemas.openxmlformats.org/officeDocument/2006/relationships" w:type="default" r:id="rId8"/>
+          <w:footerReference xmlns:r="http://schemas.openxmlformats.org/officeDocument/2006/relationships" w:type="default" r:id="rId9"/>
           <w:pgSz w:w="11907" w:h="16840"/>
           <w:pgMar w:top="2268" w:right="1134" w:bottom="1440" w:left="1701" w:header="709" w:footer="907" w:gutter="0"/>
           <w:cols w:space="720"/>
@@ -817,7 +267,7 @@
         </w:sectPr>
       </w:pPr>
     </w:p>
-    <w:p>
+    <w:p xmlns:w14="http://schemas.microsoft.com/office/word/2010/wordml" xmlns:w="http://schemas.openxmlformats.org/wordprocessingml/2006/main">
       <w:pPr>
         <w:pBdr>
           <w:top w:val="single" w:sz="4" w:space="1" w:color="auto"/>
@@ -837,11 +287,10 @@
           <w:color w:val="0070C0"/>
           <w:sz w:val="20"/>
         </w:rPr>
-        <w:lastRenderedPageBreak/>
-        <w:t xml:space="preserve">PROYECTO ORDINARIO DE URBANIZACIÓN </w:t>
+        <w:t xml:space="preserve">PROYECTO DE URBANIZACIÓN</w:t>
       </w:r>
     </w:p>
-    <w:p>
+    <w:p xmlns:w14="http://schemas.microsoft.com/office/word/2010/wordml" xmlns:w="http://schemas.openxmlformats.org/wordprocessingml/2006/main">
       <w:pPr>
         <w:pBdr>
           <w:top w:val="single" w:sz="4" w:space="1" w:color="auto"/>
@@ -864,1054 +313,49 @@
           <w:szCs w:val="24"/>
           <w:lang w:val="es-ES_tradnl"/>
         </w:rPr>
-        <w:t>AMPLIACION PLAZA MAYOR, MALAGA</w:t>
+        <w:t xml:space="preserve">AMPLIACIÓN PLAZA MAYOR, MÁLAGA</w:t>
+      </w:r>
+    </w:p>
+    <w:p xmlns:w14="http://schemas.microsoft.com/office/word/2010/wordml" xmlns:w="http://schemas.openxmlformats.org/wordprocessingml/2006/main">
+      <w:pPr>
+        <w:spacing w:before="240" w:after="60"/>
+        <w:jc w:val="center"/>
+      </w:pPr>
+      <w:r>
+        <w:rPr>
+          <w:b/>
+          <w:bCs/>
+        </w:rPr>
+        <w:t xml:space="preserve">ANEJO 1. REPORTAJE FOTOGRÁFICO</w:t>
       </w:r>
     </w:p>
     <w:p>
       <w:pPr>
         <w:pStyle w:val="Ttulo2"/>
       </w:pPr>
-      <w:bookmarkStart w:id="0" w:name="_Toc227163362"/>
+      <w:bookmarkStart w:id="0" w:name="_TocPM000001"/>
       <w:r>
-        <w:t>1. OBJETO</w:t>
+        <w:t xml:space="preserve">1. OBJETO</w:t>
       </w:r>
       <w:bookmarkEnd w:id="0"/>
     </w:p>
-    <w:p>
+    <w:p xmlns:w14="http://schemas.microsoft.com/office/word/2010/wordml" xmlns:w="http://schemas.openxmlformats.org/wordprocessingml/2006/main">
       <w:pPr>
         <w:spacing w:after="120"/>
       </w:pPr>
       <w:r>
-        <w:t>El presente anejo tiene por objeto dejar iniciado el REPORTAJE FOTOGRAFICO del Proyecto de Urbanizacion - Ampliacion Plaza Mayor, Malaga, tomando como base la informacion actualmente recopilada para el nuevo ambito y la estructura documental homologable a Guadalmar.</w:t>
+        <w:t xml:space="preserve">El presente anejo tiene por objeto ordenar el reportaje fotográfico del Proyecto de Urbanización - Ampliación Plaza Mayor, identificando la documentación gráfica de partida disponible y fijando un marco profesional para su posterior desarrollo. En esta fase inicial se incorpora únicamente la estructura documental base del anejo, quedando pendiente la carga del material fotográfico específico del ámbito.</w:t>
       </w:r>
     </w:p>
     <w:p>
       <w:pPr>
         <w:pStyle w:val="Ttulo2"/>
       </w:pPr>
-      <w:bookmarkStart w:id="1" w:name="_Toc227163363"/>
+      <w:bookmarkStart w:id="1" w:name="_TocPM000002"/>
       <w:r>
-        <w:t>2. ANTECEDENTES / INFORMACIÓN DE PARTIDA</w:t>
+        <w:t xml:space="preserve">2. REPORTAJE FOTOGRÁFICO</w:t>
       </w:r>
       <w:bookmarkEnd w:id="1"/>
-    </w:p>
-    <w:p>
-      <w:pPr>
-        <w:spacing w:after="80"/>
-      </w:pPr>
-      <w:r>
-        <w:t>[Describir la documentación de partida: cartografía, estudios previos, normativa de aplicación, datos de campo, ensayos u otros documentos de referencia.]</w:t>
-      </w:r>
-    </w:p>
-    <w:p>
-      <w:pPr>
-        <w:spacing w:after="80"/>
-      </w:pPr>
-      <w:r>
-        <w:t>La normativa de aplicación es la siguiente:</w:t>
-      </w:r>
-    </w:p>
-    <w:p>
-      <w:pPr>
-        <w:pStyle w:val="Prrafodelista"/>
-        <w:numPr>
-          <w:ilvl w:val="0"/>
-          <w:numId w:val="2"/>
-        </w:numPr>
-        <w:spacing w:before="60" w:after="60"/>
-      </w:pPr>
-      <w:r>
-        <w:t>Convenio urbanistico y documentacion base del ambito Plaza Mayor.</w:t>
-      </w:r>
-    </w:p>
-    <w:p>
-      <w:pPr>
-        <w:pStyle w:val="Prrafodelista"/>
-        <w:numPr>
-          <w:ilvl w:val="0"/>
-          <w:numId w:val="2"/>
-        </w:numPr>
-        <w:spacing w:before="60" w:after="60"/>
-      </w:pPr>
-      <w:r>
-        <w:t>Planos y documentacion grafica disponible del expediente.</w:t>
-      </w:r>
-    </w:p>
-    <w:p>
-      <w:pPr>
-        <w:pStyle w:val="Prrafodelista"/>
-        <w:numPr>
-          <w:ilvl w:val="0"/>
-          <w:numId w:val="2"/>
-        </w:numPr>
-        <w:spacing w:before="60" w:after="60"/>
-      </w:pPr>
-      <w:r>
-        <w:t>Criterios internos de reportaje y trazabilidad fotografica del proyecto.</w:t>
-      </w:r>
-    </w:p>
-    <w:p>
-      <w:pPr>
-        <w:spacing w:after="120"/>
-      </w:pPr>
-    </w:p>
-    <w:p>
-      <w:pPr>
-        <w:pStyle w:val="Ttulo2"/>
-      </w:pPr>
-      <w:bookmarkStart w:id="2" w:name="_Toc227163364"/>
-      <w:r>
-        <w:t>3. DESCRIPCIÓN / CRITERIOS / SOLUCIÓN ADOPTADA</w:t>
-      </w:r>
-      <w:bookmarkEnd w:id="2"/>
-    </w:p>
-    <w:p>
-      <w:pPr>
-        <w:spacing w:after="120"/>
-      </w:pPr>
-      <w:r>
-        <w:t>[Describir los criterios de diseño, hipótesis, condicionantes y la solución adoptada.]</w:t>
-      </w:r>
-    </w:p>
-    <w:p>
-      <w:pPr>
-        <w:pStyle w:val="Ttulo3"/>
-      </w:pPr>
-      <w:bookmarkStart w:id="3" w:name="_Toc227163365"/>
-      <w:r>
-        <w:t xml:space="preserve">3.1. </w:t>
-      </w:r>
-      <w:r>
-        <w:t>Documentacion de partida</w:t>
-      </w:r>
-      <w:bookmarkEnd w:id="3"/>
-    </w:p>
-    <w:p>
-      <w:pPr>
-        <w:spacing w:after="200"/>
-      </w:pPr>
-      <w:r>
-        <w:t>Se recopilan como base de trabajo el dossier del proyecto, las fuentes previas de Plaza Mayor y la informacion donor de Guadalmar util para orientar la redaccion.</w:t>
-      </w:r>
-    </w:p>
-    <w:p>
-      <w:pPr>
-        <w:spacing w:before="240" w:after="60"/>
-        <w:jc w:val="center"/>
-      </w:pPr>
-      <w:r>
-        <w:rPr>
-          <w:i/>
-          <w:iCs/>
-          <w:color w:val="808080"/>
-          <w:sz w:val="18"/>
-          <w:szCs w:val="18"/>
-        </w:rPr>
-        <w:t>Tabla 1. Resumen de informacion de partida</w:t>
-      </w:r>
-    </w:p>
-    <w:tbl>
-      <w:tblPr>
-        <w:tblW w:w="9072" w:type="dxa"/>
-        <w:tblBorders>
-          <w:top w:val="single" w:sz="4" w:space="0" w:color="auto"/>
-          <w:left w:val="single" w:sz="4" w:space="0" w:color="auto"/>
-          <w:bottom w:val="single" w:sz="4" w:space="0" w:color="auto"/>
-          <w:right w:val="single" w:sz="4" w:space="0" w:color="auto"/>
-          <w:insideH w:val="single" w:sz="4" w:space="0" w:color="auto"/>
-          <w:insideV w:val="single" w:sz="4" w:space="0" w:color="auto"/>
-        </w:tblBorders>
-        <w:tblCellMar>
-          <w:left w:w="10" w:type="dxa"/>
-          <w:right w:w="10" w:type="dxa"/>
-        </w:tblCellMar>
-        <w:tblLook w:val="04A0" w:firstRow="1" w:lastRow="0" w:firstColumn="1" w:lastColumn="0" w:noHBand="0" w:noVBand="1"/>
-      </w:tblPr>
-      <w:tblGrid>
-        <w:gridCol w:w="1923"/>
-        <w:gridCol w:w="1842"/>
-        <w:gridCol w:w="1893"/>
-        <w:gridCol w:w="1520"/>
-        <w:gridCol w:w="1894"/>
-      </w:tblGrid>
-      <w:tr>
-        <w:trPr>
-          <w:tblHeader/>
-        </w:trPr>
-        <w:tc>
-          <w:tcPr>
-            <w:tcW w:w="2000" w:type="dxa"/>
-            <w:tcBorders>
-              <w:top w:val="none" w:sz="0" w:space="0" w:color="FFFFFF"/>
-              <w:left w:val="none" w:sz="0" w:space="0" w:color="FFFFFF"/>
-              <w:bottom w:val="none" w:sz="0" w:space="0" w:color="FFFFFF"/>
-              <w:right w:val="none" w:sz="0" w:space="0" w:color="FFFFFF"/>
-            </w:tcBorders>
-            <w:shd w:val="clear" w:color="auto" w:fill="366092"/>
-            <w:tcMar>
-              <w:top w:w="80" w:type="dxa"/>
-              <w:left w:w="120" w:type="dxa"/>
-              <w:bottom w:w="80" w:type="dxa"/>
-              <w:right w:w="120" w:type="dxa"/>
-            </w:tcMar>
-            <w:vAlign w:val="center"/>
-          </w:tcPr>
-          <w:p>
-            <w:pPr>
-              <w:jc w:val="center"/>
-            </w:pPr>
-            <w:r>
-              <w:rPr>
-                <w:b/>
-                <w:bCs/>
-                <w:color w:val="FFFFFF"/>
-                <w:sz w:val="18"/>
-                <w:szCs w:val="18"/>
-              </w:rPr>
-              <w:t>PARÁMETRO</w:t>
-            </w:r>
-          </w:p>
-        </w:tc>
-        <w:tc>
-          <w:tcPr>
-            <w:tcW w:w="2000" w:type="dxa"/>
-            <w:tcBorders>
-              <w:top w:val="none" w:sz="0" w:space="0" w:color="FFFFFF"/>
-              <w:left w:val="none" w:sz="0" w:space="0" w:color="FFFFFF"/>
-              <w:bottom w:val="none" w:sz="0" w:space="0" w:color="FFFFFF"/>
-              <w:right w:val="none" w:sz="0" w:space="0" w:color="FFFFFF"/>
-            </w:tcBorders>
-            <w:shd w:val="clear" w:color="auto" w:fill="366092"/>
-            <w:tcMar>
-              <w:top w:w="80" w:type="dxa"/>
-              <w:left w:w="120" w:type="dxa"/>
-              <w:bottom w:w="80" w:type="dxa"/>
-              <w:right w:w="120" w:type="dxa"/>
-            </w:tcMar>
-            <w:vAlign w:val="center"/>
-          </w:tcPr>
-          <w:p>
-            <w:pPr>
-              <w:jc w:val="center"/>
-            </w:pPr>
-            <w:r>
-              <w:rPr>
-                <w:b/>
-                <w:bCs/>
-                <w:color w:val="FFFFFF"/>
-                <w:sz w:val="18"/>
-                <w:szCs w:val="18"/>
-              </w:rPr>
-              <w:t>VALOR</w:t>
-            </w:r>
-          </w:p>
-        </w:tc>
-        <w:tc>
-          <w:tcPr>
-            <w:tcW w:w="2000" w:type="dxa"/>
-            <w:tcBorders>
-              <w:top w:val="none" w:sz="0" w:space="0" w:color="FFFFFF"/>
-              <w:left w:val="none" w:sz="0" w:space="0" w:color="FFFFFF"/>
-              <w:bottom w:val="none" w:sz="0" w:space="0" w:color="FFFFFF"/>
-              <w:right w:val="none" w:sz="0" w:space="0" w:color="FFFFFF"/>
-            </w:tcBorders>
-            <w:shd w:val="clear" w:color="auto" w:fill="366092"/>
-            <w:tcMar>
-              <w:top w:w="80" w:type="dxa"/>
-              <w:left w:w="120" w:type="dxa"/>
-              <w:bottom w:w="80" w:type="dxa"/>
-              <w:right w:w="120" w:type="dxa"/>
-            </w:tcMar>
-            <w:vAlign w:val="center"/>
-          </w:tcPr>
-          <w:p>
-            <w:pPr>
-              <w:jc w:val="center"/>
-            </w:pPr>
-            <w:r>
-              <w:rPr>
-                <w:b/>
-                <w:bCs/>
-                <w:color w:val="FFFFFF"/>
-                <w:sz w:val="18"/>
-                <w:szCs w:val="18"/>
-              </w:rPr>
-              <w:t>UNIDADES</w:t>
-            </w:r>
-          </w:p>
-        </w:tc>
-        <w:tc>
-          <w:tcPr>
-            <w:tcW w:w="1536" w:type="dxa"/>
-            <w:tcBorders>
-              <w:top w:val="none" w:sz="0" w:space="0" w:color="FFFFFF"/>
-              <w:left w:val="none" w:sz="0" w:space="0" w:color="FFFFFF"/>
-              <w:bottom w:val="none" w:sz="0" w:space="0" w:color="FFFFFF"/>
-              <w:right w:val="none" w:sz="0" w:space="0" w:color="FFFFFF"/>
-            </w:tcBorders>
-            <w:shd w:val="clear" w:color="auto" w:fill="366092"/>
-            <w:tcMar>
-              <w:top w:w="80" w:type="dxa"/>
-              <w:left w:w="120" w:type="dxa"/>
-              <w:bottom w:w="80" w:type="dxa"/>
-              <w:right w:w="120" w:type="dxa"/>
-            </w:tcMar>
-            <w:vAlign w:val="center"/>
-          </w:tcPr>
-          <w:p>
-            <w:pPr>
-              <w:jc w:val="center"/>
-            </w:pPr>
-            <w:r>
-              <w:rPr>
-                <w:b/>
-                <w:bCs/>
-                <w:color w:val="FFFFFF"/>
-                <w:sz w:val="18"/>
-                <w:szCs w:val="18"/>
-              </w:rPr>
-              <w:t>NORMATIVA</w:t>
-            </w:r>
-          </w:p>
-        </w:tc>
-        <w:tc>
-          <w:tcPr>
-            <w:tcW w:w="1536" w:type="dxa"/>
-            <w:tcBorders>
-              <w:top w:val="none" w:sz="0" w:space="0" w:color="FFFFFF"/>
-              <w:left w:val="none" w:sz="0" w:space="0" w:color="FFFFFF"/>
-              <w:bottom w:val="none" w:sz="0" w:space="0" w:color="FFFFFF"/>
-              <w:right w:val="none" w:sz="0" w:space="0" w:color="FFFFFF"/>
-            </w:tcBorders>
-            <w:shd w:val="clear" w:color="auto" w:fill="366092"/>
-            <w:tcMar>
-              <w:top w:w="80" w:type="dxa"/>
-              <w:left w:w="120" w:type="dxa"/>
-              <w:bottom w:w="80" w:type="dxa"/>
-              <w:right w:w="120" w:type="dxa"/>
-            </w:tcMar>
-            <w:vAlign w:val="center"/>
-          </w:tcPr>
-          <w:p>
-            <w:pPr>
-              <w:jc w:val="center"/>
-            </w:pPr>
-            <w:r>
-              <w:rPr>
-                <w:b/>
-                <w:bCs/>
-                <w:color w:val="FFFFFF"/>
-                <w:sz w:val="18"/>
-                <w:szCs w:val="18"/>
-              </w:rPr>
-              <w:t>OBSERVACIONES</w:t>
-            </w:r>
-          </w:p>
-        </w:tc>
-      </w:tr>
-      <w:tr>
-        <w:tc>
-          <w:tcPr>
-            <w:tcW w:w="2000" w:type="dxa"/>
-            <w:tcBorders>
-              <w:top w:val="none" w:sz="0" w:space="0" w:color="FFFFFF"/>
-              <w:left w:val="none" w:sz="0" w:space="0" w:color="FFFFFF"/>
-              <w:bottom w:val="none" w:sz="0" w:space="0" w:color="FFFFFF"/>
-              <w:right w:val="none" w:sz="0" w:space="0" w:color="FFFFFF"/>
-            </w:tcBorders>
-            <w:tcMar>
-              <w:top w:w="80" w:type="dxa"/>
-              <w:left w:w="120" w:type="dxa"/>
-              <w:bottom w:w="80" w:type="dxa"/>
-              <w:right w:w="120" w:type="dxa"/>
-            </w:tcMar>
-          </w:tcPr>
-          <w:p>
-            <w:r>
-              <w:rPr>
-                <w:sz w:val="18"/>
-                <w:szCs w:val="18"/>
-              </w:rPr>
-              <w:t>Parámetro 1</w:t>
-            </w:r>
-          </w:p>
-        </w:tc>
-        <w:tc>
-          <w:tcPr>
-            <w:tcW w:w="2000" w:type="dxa"/>
-            <w:tcBorders>
-              <w:top w:val="none" w:sz="0" w:space="0" w:color="FFFFFF"/>
-              <w:left w:val="none" w:sz="0" w:space="0" w:color="FFFFFF"/>
-              <w:bottom w:val="none" w:sz="0" w:space="0" w:color="FFFFFF"/>
-              <w:right w:val="none" w:sz="0" w:space="0" w:color="FFFFFF"/>
-            </w:tcBorders>
-            <w:tcMar>
-              <w:top w:w="80" w:type="dxa"/>
-              <w:left w:w="120" w:type="dxa"/>
-              <w:bottom w:w="80" w:type="dxa"/>
-              <w:right w:w="120" w:type="dxa"/>
-            </w:tcMar>
-          </w:tcPr>
-          <w:p>
-            <w:r>
-              <w:rPr>
-                <w:sz w:val="18"/>
-                <w:szCs w:val="18"/>
-              </w:rPr>
-              <w:t>—</w:t>
-            </w:r>
-          </w:p>
-        </w:tc>
-        <w:tc>
-          <w:tcPr>
-            <w:tcW w:w="2000" w:type="dxa"/>
-            <w:tcBorders>
-              <w:top w:val="none" w:sz="0" w:space="0" w:color="FFFFFF"/>
-              <w:left w:val="none" w:sz="0" w:space="0" w:color="FFFFFF"/>
-              <w:bottom w:val="none" w:sz="0" w:space="0" w:color="FFFFFF"/>
-              <w:right w:val="none" w:sz="0" w:space="0" w:color="FFFFFF"/>
-            </w:tcBorders>
-            <w:tcMar>
-              <w:top w:w="80" w:type="dxa"/>
-              <w:left w:w="120" w:type="dxa"/>
-              <w:bottom w:w="80" w:type="dxa"/>
-              <w:right w:w="120" w:type="dxa"/>
-            </w:tcMar>
-          </w:tcPr>
-          <w:p>
-            <w:r>
-              <w:rPr>
-                <w:sz w:val="18"/>
-                <w:szCs w:val="18"/>
-              </w:rPr>
-              <w:t>—</w:t>
-            </w:r>
-          </w:p>
-        </w:tc>
-        <w:tc>
-          <w:tcPr>
-            <w:tcW w:w="1536" w:type="dxa"/>
-            <w:tcBorders>
-              <w:top w:val="none" w:sz="0" w:space="0" w:color="FFFFFF"/>
-              <w:left w:val="none" w:sz="0" w:space="0" w:color="FFFFFF"/>
-              <w:bottom w:val="none" w:sz="0" w:space="0" w:color="FFFFFF"/>
-              <w:right w:val="none" w:sz="0" w:space="0" w:color="FFFFFF"/>
-            </w:tcBorders>
-            <w:tcMar>
-              <w:top w:w="80" w:type="dxa"/>
-              <w:left w:w="120" w:type="dxa"/>
-              <w:bottom w:w="80" w:type="dxa"/>
-              <w:right w:w="120" w:type="dxa"/>
-            </w:tcMar>
-          </w:tcPr>
-          <w:p>
-            <w:r>
-              <w:rPr>
-                <w:sz w:val="18"/>
-                <w:szCs w:val="18"/>
-              </w:rPr>
-              <w:t>—</w:t>
-            </w:r>
-          </w:p>
-        </w:tc>
-        <w:tc>
-          <w:tcPr>
-            <w:tcW w:w="1536" w:type="dxa"/>
-            <w:tcBorders>
-              <w:top w:val="none" w:sz="0" w:space="0" w:color="FFFFFF"/>
-              <w:left w:val="none" w:sz="0" w:space="0" w:color="FFFFFF"/>
-              <w:bottom w:val="none" w:sz="0" w:space="0" w:color="FFFFFF"/>
-              <w:right w:val="none" w:sz="0" w:space="0" w:color="FFFFFF"/>
-            </w:tcBorders>
-            <w:tcMar>
-              <w:top w:w="80" w:type="dxa"/>
-              <w:left w:w="120" w:type="dxa"/>
-              <w:bottom w:w="80" w:type="dxa"/>
-              <w:right w:w="120" w:type="dxa"/>
-            </w:tcMar>
-          </w:tcPr>
-          <w:p>
-            <w:r>
-              <w:rPr>
-                <w:sz w:val="18"/>
-                <w:szCs w:val="18"/>
-              </w:rPr>
-              <w:t>—</w:t>
-            </w:r>
-          </w:p>
-        </w:tc>
-      </w:tr>
-      <w:tr>
-        <w:tc>
-          <w:tcPr>
-            <w:tcW w:w="2000" w:type="dxa"/>
-            <w:tcBorders>
-              <w:top w:val="none" w:sz="0" w:space="0" w:color="FFFFFF"/>
-              <w:left w:val="none" w:sz="0" w:space="0" w:color="FFFFFF"/>
-              <w:bottom w:val="none" w:sz="0" w:space="0" w:color="FFFFFF"/>
-              <w:right w:val="none" w:sz="0" w:space="0" w:color="FFFFFF"/>
-            </w:tcBorders>
-            <w:shd w:val="clear" w:color="auto" w:fill="F2F2F2"/>
-            <w:tcMar>
-              <w:top w:w="80" w:type="dxa"/>
-              <w:left w:w="120" w:type="dxa"/>
-              <w:bottom w:w="80" w:type="dxa"/>
-              <w:right w:w="120" w:type="dxa"/>
-            </w:tcMar>
-          </w:tcPr>
-          <w:p>
-            <w:r>
-              <w:rPr>
-                <w:sz w:val="18"/>
-                <w:szCs w:val="18"/>
-              </w:rPr>
-              <w:t>Parámetro 2</w:t>
-            </w:r>
-          </w:p>
-        </w:tc>
-        <w:tc>
-          <w:tcPr>
-            <w:tcW w:w="2000" w:type="dxa"/>
-            <w:tcBorders>
-              <w:top w:val="none" w:sz="0" w:space="0" w:color="FFFFFF"/>
-              <w:left w:val="none" w:sz="0" w:space="0" w:color="FFFFFF"/>
-              <w:bottom w:val="none" w:sz="0" w:space="0" w:color="FFFFFF"/>
-              <w:right w:val="none" w:sz="0" w:space="0" w:color="FFFFFF"/>
-            </w:tcBorders>
-            <w:shd w:val="clear" w:color="auto" w:fill="F2F2F2"/>
-            <w:tcMar>
-              <w:top w:w="80" w:type="dxa"/>
-              <w:left w:w="120" w:type="dxa"/>
-              <w:bottom w:w="80" w:type="dxa"/>
-              <w:right w:w="120" w:type="dxa"/>
-            </w:tcMar>
-          </w:tcPr>
-          <w:p>
-            <w:r>
-              <w:rPr>
-                <w:sz w:val="18"/>
-                <w:szCs w:val="18"/>
-              </w:rPr>
-              <w:t>—</w:t>
-            </w:r>
-          </w:p>
-        </w:tc>
-        <w:tc>
-          <w:tcPr>
-            <w:tcW w:w="2000" w:type="dxa"/>
-            <w:tcBorders>
-              <w:top w:val="none" w:sz="0" w:space="0" w:color="FFFFFF"/>
-              <w:left w:val="none" w:sz="0" w:space="0" w:color="FFFFFF"/>
-              <w:bottom w:val="none" w:sz="0" w:space="0" w:color="FFFFFF"/>
-              <w:right w:val="none" w:sz="0" w:space="0" w:color="FFFFFF"/>
-            </w:tcBorders>
-            <w:shd w:val="clear" w:color="auto" w:fill="F2F2F2"/>
-            <w:tcMar>
-              <w:top w:w="80" w:type="dxa"/>
-              <w:left w:w="120" w:type="dxa"/>
-              <w:bottom w:w="80" w:type="dxa"/>
-              <w:right w:w="120" w:type="dxa"/>
-            </w:tcMar>
-          </w:tcPr>
-          <w:p>
-            <w:r>
-              <w:rPr>
-                <w:sz w:val="18"/>
-                <w:szCs w:val="18"/>
-              </w:rPr>
-              <w:t>—</w:t>
-            </w:r>
-          </w:p>
-        </w:tc>
-        <w:tc>
-          <w:tcPr>
-            <w:tcW w:w="1536" w:type="dxa"/>
-            <w:tcBorders>
-              <w:top w:val="none" w:sz="0" w:space="0" w:color="FFFFFF"/>
-              <w:left w:val="none" w:sz="0" w:space="0" w:color="FFFFFF"/>
-              <w:bottom w:val="none" w:sz="0" w:space="0" w:color="FFFFFF"/>
-              <w:right w:val="none" w:sz="0" w:space="0" w:color="FFFFFF"/>
-            </w:tcBorders>
-            <w:shd w:val="clear" w:color="auto" w:fill="F2F2F2"/>
-            <w:tcMar>
-              <w:top w:w="80" w:type="dxa"/>
-              <w:left w:w="120" w:type="dxa"/>
-              <w:bottom w:w="80" w:type="dxa"/>
-              <w:right w:w="120" w:type="dxa"/>
-            </w:tcMar>
-          </w:tcPr>
-          <w:p>
-            <w:r>
-              <w:rPr>
-                <w:sz w:val="18"/>
-                <w:szCs w:val="18"/>
-              </w:rPr>
-              <w:t>—</w:t>
-            </w:r>
-          </w:p>
-        </w:tc>
-        <w:tc>
-          <w:tcPr>
-            <w:tcW w:w="1536" w:type="dxa"/>
-            <w:tcBorders>
-              <w:top w:val="none" w:sz="0" w:space="0" w:color="FFFFFF"/>
-              <w:left w:val="none" w:sz="0" w:space="0" w:color="FFFFFF"/>
-              <w:bottom w:val="none" w:sz="0" w:space="0" w:color="FFFFFF"/>
-              <w:right w:val="none" w:sz="0" w:space="0" w:color="FFFFFF"/>
-            </w:tcBorders>
-            <w:shd w:val="clear" w:color="auto" w:fill="F2F2F2"/>
-            <w:tcMar>
-              <w:top w:w="80" w:type="dxa"/>
-              <w:left w:w="120" w:type="dxa"/>
-              <w:bottom w:w="80" w:type="dxa"/>
-              <w:right w:w="120" w:type="dxa"/>
-            </w:tcMar>
-          </w:tcPr>
-          <w:p>
-            <w:r>
-              <w:rPr>
-                <w:sz w:val="18"/>
-                <w:szCs w:val="18"/>
-              </w:rPr>
-              <w:t>—</w:t>
-            </w:r>
-          </w:p>
-        </w:tc>
-      </w:tr>
-      <w:tr>
-        <w:tc>
-          <w:tcPr>
-            <w:tcW w:w="2000" w:type="dxa"/>
-            <w:tcBorders>
-              <w:top w:val="none" w:sz="0" w:space="0" w:color="FFFFFF"/>
-              <w:left w:val="none" w:sz="0" w:space="0" w:color="FFFFFF"/>
-              <w:bottom w:val="none" w:sz="0" w:space="0" w:color="FFFFFF"/>
-              <w:right w:val="none" w:sz="0" w:space="0" w:color="FFFFFF"/>
-            </w:tcBorders>
-            <w:tcMar>
-              <w:top w:w="80" w:type="dxa"/>
-              <w:left w:w="120" w:type="dxa"/>
-              <w:bottom w:w="80" w:type="dxa"/>
-              <w:right w:w="120" w:type="dxa"/>
-            </w:tcMar>
-          </w:tcPr>
-          <w:p>
-            <w:r>
-              <w:rPr>
-                <w:sz w:val="18"/>
-                <w:szCs w:val="18"/>
-              </w:rPr>
-              <w:t>Parámetro 3</w:t>
-            </w:r>
-          </w:p>
-        </w:tc>
-        <w:tc>
-          <w:tcPr>
-            <w:tcW w:w="2000" w:type="dxa"/>
-            <w:tcBorders>
-              <w:top w:val="none" w:sz="0" w:space="0" w:color="FFFFFF"/>
-              <w:left w:val="none" w:sz="0" w:space="0" w:color="FFFFFF"/>
-              <w:bottom w:val="none" w:sz="0" w:space="0" w:color="FFFFFF"/>
-              <w:right w:val="none" w:sz="0" w:space="0" w:color="FFFFFF"/>
-            </w:tcBorders>
-            <w:tcMar>
-              <w:top w:w="80" w:type="dxa"/>
-              <w:left w:w="120" w:type="dxa"/>
-              <w:bottom w:w="80" w:type="dxa"/>
-              <w:right w:w="120" w:type="dxa"/>
-            </w:tcMar>
-          </w:tcPr>
-          <w:p>
-            <w:r>
-              <w:rPr>
-                <w:sz w:val="18"/>
-                <w:szCs w:val="18"/>
-              </w:rPr>
-              <w:t>—</w:t>
-            </w:r>
-          </w:p>
-        </w:tc>
-        <w:tc>
-          <w:tcPr>
-            <w:tcW w:w="2000" w:type="dxa"/>
-            <w:tcBorders>
-              <w:top w:val="none" w:sz="0" w:space="0" w:color="FFFFFF"/>
-              <w:left w:val="none" w:sz="0" w:space="0" w:color="FFFFFF"/>
-              <w:bottom w:val="none" w:sz="0" w:space="0" w:color="FFFFFF"/>
-              <w:right w:val="none" w:sz="0" w:space="0" w:color="FFFFFF"/>
-            </w:tcBorders>
-            <w:tcMar>
-              <w:top w:w="80" w:type="dxa"/>
-              <w:left w:w="120" w:type="dxa"/>
-              <w:bottom w:w="80" w:type="dxa"/>
-              <w:right w:w="120" w:type="dxa"/>
-            </w:tcMar>
-          </w:tcPr>
-          <w:p>
-            <w:r>
-              <w:rPr>
-                <w:sz w:val="18"/>
-                <w:szCs w:val="18"/>
-              </w:rPr>
-              <w:t>—</w:t>
-            </w:r>
-          </w:p>
-        </w:tc>
-        <w:tc>
-          <w:tcPr>
-            <w:tcW w:w="1536" w:type="dxa"/>
-            <w:tcBorders>
-              <w:top w:val="none" w:sz="0" w:space="0" w:color="FFFFFF"/>
-              <w:left w:val="none" w:sz="0" w:space="0" w:color="FFFFFF"/>
-              <w:bottom w:val="none" w:sz="0" w:space="0" w:color="FFFFFF"/>
-              <w:right w:val="none" w:sz="0" w:space="0" w:color="FFFFFF"/>
-            </w:tcBorders>
-            <w:tcMar>
-              <w:top w:w="80" w:type="dxa"/>
-              <w:left w:w="120" w:type="dxa"/>
-              <w:bottom w:w="80" w:type="dxa"/>
-              <w:right w:w="120" w:type="dxa"/>
-            </w:tcMar>
-          </w:tcPr>
-          <w:p>
-            <w:r>
-              <w:rPr>
-                <w:sz w:val="18"/>
-                <w:szCs w:val="18"/>
-              </w:rPr>
-              <w:t>—</w:t>
-            </w:r>
-          </w:p>
-        </w:tc>
-        <w:tc>
-          <w:tcPr>
-            <w:tcW w:w="1536" w:type="dxa"/>
-            <w:tcBorders>
-              <w:top w:val="none" w:sz="0" w:space="0" w:color="FFFFFF"/>
-              <w:left w:val="none" w:sz="0" w:space="0" w:color="FFFFFF"/>
-              <w:bottom w:val="none" w:sz="0" w:space="0" w:color="FFFFFF"/>
-              <w:right w:val="none" w:sz="0" w:space="0" w:color="FFFFFF"/>
-            </w:tcBorders>
-            <w:tcMar>
-              <w:top w:w="80" w:type="dxa"/>
-              <w:left w:w="120" w:type="dxa"/>
-              <w:bottom w:w="80" w:type="dxa"/>
-              <w:right w:w="120" w:type="dxa"/>
-            </w:tcMar>
-          </w:tcPr>
-          <w:p>
-            <w:r>
-              <w:rPr>
-                <w:sz w:val="18"/>
-                <w:szCs w:val="18"/>
-              </w:rPr>
-              <w:t>—</w:t>
-            </w:r>
-          </w:p>
-        </w:tc>
-      </w:tr>
-    </w:tbl>
-    <w:p>
-      <w:pPr>
-        <w:spacing w:before="60" w:after="240"/>
-        <w:jc w:val="right"/>
-      </w:pPr>
-      <w:r>
-        <w:rPr>
-          <w:i/>
-          <w:iCs/>
-          <w:color w:val="808080"/>
-          <w:sz w:val="18"/>
-          <w:szCs w:val="18"/>
-        </w:rPr>
-        <w:t>Fuente: dossier base Plaza Mayor, documentacion recopilada y referencias donor de Guadalmar.</w:t>
-      </w:r>
-    </w:p>
-    <w:p>
-      <w:pPr>
-        <w:pStyle w:val="Ttulo3"/>
-      </w:pPr>
-      <w:bookmarkStart w:id="4" w:name="_Toc227163366"/>
-      <w:r>
-        <w:t xml:space="preserve">3.2. </w:t>
-      </w:r>
-      <w:r>
-        <w:t>Criterios de adaptacion</w:t>
-      </w:r>
-      <w:bookmarkEnd w:id="4"/>
-    </w:p>
-    <w:p>
-      <w:pPr>
-        <w:spacing w:after="120"/>
-      </w:pPr>
-      <w:r>
-        <w:t>La redaccion definitiva se adaptara al ambito de Plaza Mayor, sustituyendo referencias, superficies, mediciones, alineaciones, redes y soluciones por las que correspondan al nuevo proyecto.</w:t>
-      </w:r>
-    </w:p>
-    <w:p>
-      <w:pPr>
-        <w:pStyle w:val="Ttulo4"/>
-      </w:pPr>
-      <w:bookmarkStart w:id="5" w:name="_Toc227163367"/>
-      <w:r>
-        <w:t xml:space="preserve">3.2.1. </w:t>
-      </w:r>
-      <w:r>
-        <w:t>Trabajos pendientes</w:t>
-      </w:r>
-      <w:bookmarkEnd w:id="5"/>
-    </w:p>
-    <w:p>
-      <w:pPr>
-        <w:spacing w:after="120"/>
-      </w:pPr>
-      <w:r>
-        <w:t>Quedan pendientes la carga de mediciones reales, la revision tecnica especifica del ambito y la comprobacion cruzada con presupuesto, planos y trazabilidad.</w:t>
-      </w:r>
-    </w:p>
-    <w:p>
-      <w:pPr>
-        <w:spacing w:after="80"/>
-      </w:pPr>
-      <w:r>
-        <w:t>Los pasos del proceso son los siguientes:</w:t>
-      </w:r>
-    </w:p>
-    <w:p>
-      <w:pPr>
-        <w:pStyle w:val="Prrafodelista"/>
-        <w:numPr>
-          <w:ilvl w:val="0"/>
-          <w:numId w:val="3"/>
-        </w:numPr>
-        <w:spacing w:before="60" w:after="60"/>
-      </w:pPr>
-      <w:r>
-        <w:t>Inventariar la informacion especifica ya disponible del ambito Plaza Mayor.</w:t>
-      </w:r>
-    </w:p>
-    <w:p>
-      <w:pPr>
-        <w:pStyle w:val="Prrafodelista"/>
-        <w:numPr>
-          <w:ilvl w:val="0"/>
-          <w:numId w:val="3"/>
-        </w:numPr>
-        <w:spacing w:before="60" w:after="60"/>
-      </w:pPr>
-      <w:r>
-        <w:t>Sustituir referencias donor por datos, mediciones, nombres y soluciones propias del nuevo proyecto.</w:t>
-      </w:r>
-    </w:p>
-    <w:p>
-      <w:pPr>
-        <w:pStyle w:val="Prrafodelista"/>
-        <w:numPr>
-          <w:ilvl w:val="0"/>
-          <w:numId w:val="3"/>
-        </w:numPr>
-        <w:spacing w:before="60" w:after="60"/>
-      </w:pPr>
-      <w:r>
-        <w:t>Cerrar coherencia con presupuesto, planos, trazabilidad y memoria general.</w:t>
-      </w:r>
-    </w:p>
-    <w:p>
-      <w:pPr>
-        <w:spacing w:after="120"/>
-      </w:pPr>
-    </w:p>
-    <w:p>
-      <w:pPr>
-        <w:spacing w:before="240"/>
-        <w:jc w:val="center"/>
-      </w:pPr>
-      <w:r>
-        <w:t>Espacio reservado para grafico, plano o captura del soporte tecnico correspondiente.</w:t>
-      </w:r>
-    </w:p>
-    <w:p>
-      <w:pPr>
-        <w:spacing w:before="60" w:after="240"/>
-        <w:jc w:val="center"/>
-      </w:pPr>
-      <w:r>
-        <w:rPr>
-          <w:i/>
-          <w:iCs/>
-          <w:color w:val="808080"/>
-          <w:sz w:val="18"/>
-          <w:szCs w:val="18"/>
-        </w:rPr>
-        <w:t>Figura 1. Esquema o soporte tecnico del anejo. Fuente: documentacion del proyecto Plaza Mayor.</w:t>
-      </w:r>
-    </w:p>
-    <w:p>
-      <w:pPr>
-        <w:pStyle w:val="Ttulo2"/>
-      </w:pPr>
-      <w:bookmarkStart w:id="6" w:name="_Toc227163368"/>
-      <w:r>
-        <w:lastRenderedPageBreak/>
-        <w:t>4. JUSTIFICACIÓN / CÁLCULOS / DESARROLLO</w:t>
-      </w:r>
-      <w:bookmarkEnd w:id="6"/>
-    </w:p>
-    <w:p>
-      <w:pPr>
-        <w:spacing w:after="120"/>
-      </w:pPr>
-      <w:r>
-        <w:t>[Desarrollo del contenido técnico. Describir metodología, proceso de cálculo o análisis. Referenciar apéndices cuando el volumen lo requiera.]</w:t>
-      </w:r>
-    </w:p>
-    <w:p>
-      <w:pPr>
-        <w:pStyle w:val="Ttulo3"/>
-      </w:pPr>
-      <w:bookmarkStart w:id="7" w:name="_Toc227163369"/>
-      <w:r>
-        <w:t>4.1. [Primer subapartado de cálculo]</w:t>
-      </w:r>
-      <w:bookmarkEnd w:id="7"/>
-    </w:p>
-    <w:p>
-      <w:pPr>
-        <w:spacing w:after="120"/>
-      </w:pPr>
-      <w:r>
-        <w:t>[Planteamiento. Fórmulas y justificación de valores adoptados.]</w:t>
-      </w:r>
-    </w:p>
-    <w:p>
-      <w:pPr>
-        <w:pStyle w:val="Ttulo3"/>
-      </w:pPr>
-      <w:bookmarkStart w:id="8" w:name="_Toc227163370"/>
-      <w:r>
-        <w:t>4.2. [Segundo subapartado de cálculo]</w:t>
-      </w:r>
-      <w:bookmarkEnd w:id="8"/>
-    </w:p>
-    <w:p>
-      <w:pPr>
-        <w:spacing w:after="120"/>
-      </w:pPr>
-      <w:r>
-        <w:t>[Continuación del desarrollo. Tablas de resultados intermedios si procede.]</w:t>
-      </w:r>
-    </w:p>
-    <w:p>
-      <w:pPr>
-        <w:pStyle w:val="Ttulo2"/>
-      </w:pPr>
-      <w:bookmarkStart w:id="9" w:name="_Toc227163371"/>
-      <w:r>
-        <w:t>5. CONCLUSIONES</w:t>
-      </w:r>
-      <w:bookmarkEnd w:id="9"/>
-    </w:p>
-    <w:p>
-      <w:pPr>
-        <w:spacing w:after="80"/>
-      </w:pPr>
-      <w:r>
-        <w:t>A la vista de los análisis realizados, se extraen las siguientes conclusiones:</w:t>
-      </w:r>
-    </w:p>
-    <w:p>
-      <w:pPr>
-        <w:pStyle w:val="Prrafodelista"/>
-        <w:numPr>
-          <w:ilvl w:val="0"/>
-          <w:numId w:val="2"/>
-        </w:numPr>
-        <w:spacing w:before="60" w:after="60"/>
-      </w:pPr>
-      <w:r>
-        <w:t>[Conclusión 1. Resultado principal.]</w:t>
-      </w:r>
-    </w:p>
-    <w:p>
-      <w:pPr>
-        <w:pStyle w:val="Prrafodelista"/>
-        <w:numPr>
-          <w:ilvl w:val="0"/>
-          <w:numId w:val="2"/>
-        </w:numPr>
-        <w:spacing w:before="60" w:after="60"/>
-      </w:pPr>
-      <w:r>
-        <w:t>[Conclusión 2.]</w:t>
-      </w:r>
-    </w:p>
-    <w:p>
-      <w:pPr>
-        <w:pStyle w:val="Prrafodelista"/>
-        <w:numPr>
-          <w:ilvl w:val="0"/>
-          <w:numId w:val="2"/>
-        </w:numPr>
-        <w:spacing w:before="60" w:after="60"/>
-      </w:pPr>
-      <w:r>
-        <w:t>[Conclusión 3.]</w:t>
-      </w:r>
-    </w:p>
-    <w:p>
-      <w:pPr>
-        <w:spacing w:after="120"/>
-      </w:pPr>
-    </w:p>
-    <w:p>
-      <w:pPr>
-        <w:spacing w:after="240"/>
-      </w:pPr>
-      <w:r>
-        <w:t>Los resultados obtenidos son conformes con la normativa de aplicación y se consideran adecuados para los fines del proyecto.</w:t>
-      </w:r>
-    </w:p>
-    <w:p>
-      <w:r>
-        <w:br w:type="page"/>
-      </w:r>
-    </w:p>
-    <w:p>
-      <w:pPr>
-        <w:spacing w:before="480" w:after="120"/>
-        <w:jc w:val="center"/>
-      </w:pPr>
-      <w:r>
-        <w:rPr>
-          <w:b/>
-          <w:bCs/>
-          <w:color w:val="366092"/>
-          <w:sz w:val="24"/>
-          <w:szCs w:val="24"/>
-        </w:rPr>
-        <w:lastRenderedPageBreak/>
-        <w:t>APÉNDICE I</w:t>
-      </w:r>
-    </w:p>
-    <w:p>
-      <w:pPr>
-        <w:spacing w:after="480"/>
-        <w:jc w:val="center"/>
-      </w:pPr>
-      <w:r>
-        <w:rPr>
-          <w:b/>
-          <w:bCs/>
-          <w:sz w:val="22"/>
-          <w:szCs w:val="22"/>
-        </w:rPr>
-        <w:t>[TÍTULO DEL APÉNDICE]</w:t>
-      </w:r>
-    </w:p>
-    <w:p>
-      <w:r>
-        <w:t>[Contenido del apéndice: tablas extensas, planos, fichas, cálculos auxiliares, etc.]</w:t>
-      </w:r>
     </w:p>
     <w:sectPr>
       <w:headerReference w:type="default" r:id="rId10"/>
@@ -3067,7 +1511,7 @@
               <v:stroke joinstyle="miter"/>
               <v:path gradientshapeok="t" o:connecttype="rect"/>
             </v:shapetype>
-            <v:shape id="_x0000_s1031" type="#_x0000_t202" style="position:absolute;left:0;text-align:left;margin-left:319.55pt;margin-top:797.85pt;width:135pt;height:27pt;z-index:251661312;visibility:visible;mso-wrap-style:square;mso-width-percent:0;mso-height-percent:0;mso-wrap-distance-left:9pt;mso-wrap-distance-top:0;mso-wrap-distance-right:9pt;mso-wrap-distance-bottom:0;mso-position-horizontal:absolute;mso-position-horizontal-relative:page;mso-position-vertical:absolute;mso-position-vertical-relative:page;mso-width-percent:0;mso-height-percent:0;mso-width-relative:margin;mso-height-relative:margin;v-text-anchor:top" o:gfxdata="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" filled="f" stroked="f">
+            <v:shape id="_x0000_s1032" type="#_x0000_t202" style="position:absolute;left:0;text-align:left;margin-left:319.55pt;margin-top:797.85pt;width:135pt;height:27pt;z-index:251661312;visibility:visible;mso-wrap-style:square;mso-width-percent:0;mso-height-percent:0;mso-wrap-distance-left:9pt;mso-wrap-distance-top:0;mso-wrap-distance-right:9pt;mso-wrap-distance-bottom:0;mso-position-horizontal:absolute;mso-position-horizontal-relative:page;mso-position-vertical:absolute;mso-position-vertical-relative:page;mso-width-percent:0;mso-height-percent:0;mso-width-relative:margin;mso-height-relative:margin;v-text-anchor:top" o:gfxdata="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" filled="f" stroked="f">
               <v:textbox>
                 <w:txbxContent>
                   <w:p>
@@ -3225,7 +1669,7 @@
         </mc:Choice>
         <mc:Fallback>
           <w:pict>
-            <v:shape w14:anchorId="003E73B6" id="_x0000_s1032" type="#_x0000_t202" style="position:absolute;left:0;text-align:left;margin-left:112.55pt;margin-top:797.85pt;width:63pt;height:27pt;z-index:251651072;visibility:visible;mso-wrap-style:square;mso-width-percent:0;mso-height-percent:0;mso-wrap-distance-left:9pt;mso-wrap-distance-top:0;mso-wrap-distance-right:9pt;mso-wrap-distance-bottom:0;mso-position-horizontal:absolute;mso-position-horizontal-relative:page;mso-position-vertical:absolute;mso-position-vertical-relative:page;mso-width-percent:0;mso-height-percent:0;mso-width-relative:margin;mso-height-relative:margin;v-text-anchor:top" o:gfxdata="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" filled="f" stroked="f">
+            <v:shape w14:anchorId="003E73B6" id="_x0000_s1033" type="#_x0000_t202" style="position:absolute;left:0;text-align:left;margin-left:112.55pt;margin-top:797.85pt;width:63pt;height:27pt;z-index:251651072;visibility:visible;mso-wrap-style:square;mso-width-percent:0;mso-height-percent:0;mso-wrap-distance-left:9pt;mso-wrap-distance-top:0;mso-wrap-distance-right:9pt;mso-wrap-distance-bottom:0;mso-position-horizontal:absolute;mso-position-horizontal-relative:page;mso-position-vertical:absolute;mso-position-vertical-relative:page;mso-width-percent:0;mso-height-percent:0;mso-width-relative:margin;mso-height-relative:margin;v-text-anchor:top" o:gfxdata="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" filled="f" stroked="f">
               <v:textbox>
                 <w:txbxContent>
                   <w:p>
@@ -3385,7 +1829,7 @@
         </mc:Choice>
         <mc:Fallback>
           <w:pict>
-            <v:shape w14:anchorId="00F01480" id="_x0000_s1033" type="#_x0000_t202" style="position:absolute;left:0;text-align:left;margin-left:211.55pt;margin-top:797.85pt;width:108pt;height:27pt;z-index:251657216;visibility:visible;mso-wrap-style:square;mso-width-percent:0;mso-height-percent:0;mso-wrap-distance-left:9pt;mso-wrap-distance-top:0;mso-wrap-distance-right:9pt;mso-wrap-distance-bottom:0;mso-position-horizontal:absolute;mso-position-horizontal-relative:page;mso-position-vertical:absolute;mso-position-vertical-relative:page;mso-width-percent:0;mso-height-percent:0;mso-width-relative:margin;mso-height-relative:margin;v-text-anchor:top" o:gfxdata="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" filled="f" stroked="f">
+            <v:shape w14:anchorId="00F01480" id="_x0000_s1034" type="#_x0000_t202" style="position:absolute;left:0;text-align:left;margin-left:211.55pt;margin-top:797.85pt;width:108pt;height:27pt;z-index:251657216;visibility:visible;mso-wrap-style:square;mso-width-percent:0;mso-height-percent:0;mso-wrap-distance-left:9pt;mso-wrap-distance-top:0;mso-wrap-distance-right:9pt;mso-wrap-distance-bottom:0;mso-position-horizontal:absolute;mso-position-horizontal-relative:page;mso-position-vertical:absolute;mso-position-vertical-relative:page;mso-width-percent:0;mso-height-percent:0;mso-width-relative:margin;mso-height-relative:margin;v-text-anchor:top" o:gfxdata="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" filled="f" stroked="f">
               <v:textbox>
                 <w:txbxContent>
                   <w:p>
@@ -3724,7 +2168,7 @@
         </mc:Choice>
         <mc:Fallback>
           <w:pict>
-            <v:shape w14:anchorId="60968E5B" id="_x0000_s1034" type="#_x0000_t202" style="position:absolute;left:0;text-align:left;margin-left:463.85pt;margin-top:800.15pt;width:82.45pt;height:24.7pt;z-index:251665408;visibility:visible;mso-wrap-style:square;mso-width-percent:0;mso-height-percent:0;mso-wrap-distance-left:9pt;mso-wrap-distance-top:0;mso-wrap-distance-right:9pt;mso-wrap-distance-bottom:0;mso-position-horizontal:absolute;mso-position-horizontal-relative:page;mso-position-vertical:absolute;mso-position-vertical-relative:page;mso-width-percent:0;mso-height-percent:0;mso-width-relative:margin;mso-height-relative:margin;v-text-anchor:middle" o:gfxdata="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" filled="f" stroked="f">
+            <v:shape w14:anchorId="60968E5B" id="_x0000_s1035" type="#_x0000_t202" style="position:absolute;left:0;text-align:left;margin-left:463.85pt;margin-top:800.15pt;width:82.45pt;height:24.7pt;z-index:251665408;visibility:visible;mso-wrap-style:square;mso-width-percent:0;mso-height-percent:0;mso-wrap-distance-left:9pt;mso-wrap-distance-top:0;mso-wrap-distance-right:9pt;mso-wrap-distance-bottom:0;mso-position-horizontal:absolute;mso-position-horizontal-relative:page;mso-position-vertical:absolute;mso-position-vertical-relative:page;mso-width-percent:0;mso-height-percent:0;mso-width-relative:margin;mso-height-relative:margin;v-text-anchor:middle" o:gfxdata="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" filled="f" stroked="f">
               <v:textbox>
                 <w:txbxContent>
                   <w:p>
@@ -4101,7 +2545,7 @@
                               <w:sz w:val="12"/>
                               <w:szCs w:val="12"/>
                             </w:rPr>
-                            <w:t>PROYECTO ORDINARIO DE URBANIZACIÓN DE</w:t>
+                            <w:t xml:space="preserve">PROYECTO DE URBANIZACIÓN</w:t>
                           </w:r>
                         </w:p>
                         <w:p>
@@ -4119,16 +2563,14 @@
                               <w:sz w:val="12"/>
                               <w:szCs w:val="12"/>
                             </w:rPr>
-                            <w:t>MEJORA DE CARRETERA DE GUADALMAR</w:t>
+                            <w:t xml:space="preserve">Proyecto de urbanización - Ampliación Plaza Mayor</w:t>
                           </w:r>
                         </w:p>
                         <w:p>
                           <w:pPr>
                             <w:jc w:val="left"/>
                             <w:rPr>
-                              <w:bCs/>
-                              <w:caps/>
-                              <w:color w:val="auto"/>
+                              <w:color w:val="0F4761" w:themeColor="accent1" w:themeShade="BF"/>
                               <w:sz w:val="12"/>
                               <w:szCs w:val="12"/>
                             </w:rPr>
@@ -4141,7 +2583,7 @@
                               <w:sz w:val="12"/>
                               <w:szCs w:val="12"/>
                             </w:rPr>
-                            <w:t>DEL PGOU DE MÁLAGA</w:t>
+                            <w:t xml:space="preserve">DEL PGOU DE Málaga</w:t>
                           </w:r>
                         </w:p>
                         <w:p>
@@ -4173,7 +2615,7 @@
                               <w:sz w:val="12"/>
                               <w:szCs w:val="12"/>
                             </w:rPr>
-                            <w:t>[NOMBRE DEL DOCX]</w:t>
+                            <w:t xml:space="preserve">ANEJO 1. REPORTAJE FOTOGRÁFICO</w:t>
                           </w:r>
                         </w:p>
                         <w:p>
@@ -4237,7 +2679,7 @@
                         <w:sz w:val="12"/>
                         <w:szCs w:val="12"/>
                       </w:rPr>
-                      <w:t>PROYECTO ORDINARIO DE URBANIZACIÓN DE</w:t>
+                      <w:t xml:space="preserve">PROYECTO DE URBANIZACIÓN</w:t>
                     </w:r>
                   </w:p>
                   <w:p>
@@ -4255,16 +2697,14 @@
                         <w:sz w:val="12"/>
                         <w:szCs w:val="12"/>
                       </w:rPr>
-                      <w:t>MEJORA DE CARRETERA DE GUADALMAR</w:t>
+                      <w:t xml:space="preserve">Proyecto de urbanización - Ampliación Plaza Mayor</w:t>
                     </w:r>
                   </w:p>
                   <w:p>
                     <w:pPr>
                       <w:jc w:val="left"/>
                       <w:rPr>
-                        <w:bCs/>
-                        <w:caps/>
-                        <w:color w:val="auto"/>
+                        <w:color w:val="0F4761" w:themeColor="accent1" w:themeShade="BF"/>
                         <w:sz w:val="12"/>
                         <w:szCs w:val="12"/>
                       </w:rPr>
@@ -4277,7 +2717,7 @@
                         <w:sz w:val="12"/>
                         <w:szCs w:val="12"/>
                       </w:rPr>
-                      <w:t>DEL PGOU DE MÁLAGA</w:t>
+                      <w:t xml:space="preserve">DEL PGOU DE Málaga</w:t>
                     </w:r>
                   </w:p>
                   <w:p>
@@ -4309,7 +2749,7 @@
                         <w:sz w:val="12"/>
                         <w:szCs w:val="12"/>
                       </w:rPr>
-                      <w:t>[NOMBRE DEL DOCX]</w:t>
+                      <w:t xml:space="preserve">ANEJO 1. REPORTAJE FOTOGRÁFICO</w:t>
                     </w:r>
                   </w:p>
                   <w:p>
@@ -4412,13 +2852,312 @@
     </w:pPr>
     <w:r>
       <w:rPr>
-        <w:noProof/>
+        <w:color w:val="366092"/>
+        <w:sz w:val="12"/>
+        <w:szCs w:val="12"/>
       </w:rPr>
+      <w:br/>
+    </w:r>
+    <w:r>
+      <mc:AlternateContent>
+        <mc:Choice Requires="wps">
+          <w:drawing>
+            <wp:anchor distT="45720" distB="45720" distL="114300" distR="114300" simplePos="0" relativeHeight="251669504" behindDoc="1" locked="0" layoutInCell="1" allowOverlap="1" wp14:anchorId="18CDF65E" wp14:editId="30713A0F">
+              <wp:simplePos x="0" y="0"/>
+              <wp:positionH relativeFrom="column">
+                <wp:posOffset>3752215</wp:posOffset>
+              </wp:positionH>
+              <wp:positionV relativeFrom="paragraph">
+                <wp:posOffset>635</wp:posOffset>
+              </wp:positionV>
+              <wp:extent cx="2223770" cy="711200"/>
+              <wp:effectExtent l="0" t="0" r="5080" b="0"/>
+              <wp:wrapNone/>
+              <wp:docPr id="1098401556" name="Cuadro de texto 12"/>
+              <wp:cNvGraphicFramePr>
+                <a:graphicFrameLocks xmlns:a="http://schemas.openxmlformats.org/drawingml/2006/main"/>
+              </wp:cNvGraphicFramePr>
+              <a:graphic xmlns:a="http://schemas.openxmlformats.org/drawingml/2006/main">
+                <a:graphicData uri="http://schemas.microsoft.com/office/word/2010/wordprocessingShape">
+                  <wps:wsp>
+                    <wps:cNvSpPr txBox="1">
+                      <a:spLocks noChangeArrowheads="1"/>
+                    </wps:cNvSpPr>
+                    <wps:spPr bwMode="auto">
+                      <a:xfrm>
+                        <a:off x="0" y="0"/>
+                        <a:ext cx="2223770" cy="711200"/>
+                      </a:xfrm>
+                      <a:prstGeom prst="rect">
+                        <a:avLst/>
+                      </a:prstGeom>
+                      <a:solidFill>
+                        <a:srgbClr val="FFFFFF"/>
+                      </a:solidFill>
+                      <a:ln w="9525">
+                        <a:noFill/>
+                        <a:miter lim="800000"/>
+                        <a:headEnd/>
+                        <a:tailEnd/>
+                      </a:ln>
+                    </wps:spPr>
+                    <wps:txbx>
+                      <w:txbxContent>
+                        <w:p>
+                          <w:pPr>
+                            <w:jc w:val="left"/>
+                            <w:rPr>
+                              <w:color w:val="0F4761" w:themeColor="accent1" w:themeShade="BF"/>
+                              <w:sz w:val="12"/>
+                              <w:szCs w:val="12"/>
+                            </w:rPr>
+                          </w:pPr>
+                          <w:r>
+                            <w:rPr>
+                              <w:color w:val="0F4761" w:themeColor="accent1" w:themeShade="BF"/>
+                              <w:sz w:val="12"/>
+                              <w:szCs w:val="12"/>
+                            </w:rPr>
+                            <w:t xml:space="preserve">PROYECTO DE URBANIZACIÓN</w:t>
+                          </w:r>
+                        </w:p>
+                        <w:p>
+                          <w:pPr>
+                            <w:jc w:val="left"/>
+                            <w:rPr>
+                              <w:color w:val="0F4761" w:themeColor="accent1" w:themeShade="BF"/>
+                              <w:sz w:val="12"/>
+                              <w:szCs w:val="12"/>
+                            </w:rPr>
+                          </w:pPr>
+                          <w:r>
+                            <w:rPr>
+                              <w:color w:val="0F4761" w:themeColor="accent1" w:themeShade="BF"/>
+                              <w:sz w:val="12"/>
+                              <w:szCs w:val="12"/>
+                            </w:rPr>
+                            <w:t xml:space="preserve">Proyecto de urbanización - Ampliación Plaza Mayor</w:t>
+                          </w:r>
+                        </w:p>
+                        <w:p>
+                          <w:pPr>
+                            <w:jc w:val="left"/>
+                            <w:rPr>
+                              <w:color w:val="0F4761" w:themeColor="accent1" w:themeShade="BF"/>
+                              <w:sz w:val="12"/>
+                              <w:szCs w:val="12"/>
+                            </w:rPr>
+                          </w:pPr>
+                          <w:r>
+                            <w:rPr>
+                              <w:b/>
+                              <w:bCs/>
+                              <w:caps/>
+                              <w:sz w:val="12"/>
+                              <w:szCs w:val="12"/>
+                            </w:rPr>
+                            <w:t xml:space="preserve">DEL PGOU DE Málaga</w:t>
+                          </w:r>
+                        </w:p>
+                        <w:p>
+                          <w:pPr>
+                            <w:jc w:val="left"/>
+                            <w:rPr>
+                              <w:b/>
+                              <w:bCs/>
+                              <w:caps/>
+                              <w:sz w:val="12"/>
+                              <w:szCs w:val="12"/>
+                            </w:rPr>
+                          </w:pPr>
+                        </w:p>
+                        <w:p>
+                          <w:pPr>
+                            <w:jc w:val="left"/>
+                            <w:rPr>
+                              <w:b/>
+                              <w:caps/>
+                              <w:color w:val="80340D" w:themeColor="accent2" w:themeShade="80"/>
+                              <w:sz w:val="12"/>
+                              <w:szCs w:val="12"/>
+                            </w:rPr>
+                          </w:pPr>
+                          <w:r>
+                            <w:rPr>
+                              <w:color w:val="80340D" w:themeColor="accent2" w:themeShade="80"/>
+                              <w:sz w:val="12"/>
+                              <w:szCs w:val="12"/>
+                            </w:rPr>
+                            <w:t xml:space="preserve">ANEJO 1. REPORTAJE FOTOGRÁFICO</w:t>
+                          </w:r>
+                        </w:p>
+                        <w:p>
+                          <w:pPr>
+                            <w:jc w:val="left"/>
+                            <w:rPr>
+                              <w:bCs/>
+                              <w:color w:val="auto"/>
+                              <w:sz w:val="14"/>
+                              <w:szCs w:val="14"/>
+                            </w:rPr>
+                          </w:pPr>
+                        </w:p>
+                        <w:p>
+                          <w:pPr>
+                            <w:rPr>
+                              <w:rFonts w:asciiTheme="minorHAnsi" w:hAnsiTheme="minorHAnsi"/>
+                              <w:sz w:val="22"/>
+                              <w:szCs w:val="22"/>
+                            </w:rPr>
+                          </w:pPr>
+                        </w:p>
+                      </w:txbxContent>
+                    </wps:txbx>
+                    <wps:bodyPr rot="0" vertOverflow="clip" horzOverflow="clip" vert="horz" wrap="square" lIns="91440" tIns="45720" rIns="91440" bIns="45720" anchor="t" anchorCtr="0">
+                      <a:noAutofit/>
+                    </wps:bodyPr>
+                  </wps:wsp>
+                </a:graphicData>
+              </a:graphic>
+              <wp14:sizeRelH relativeFrom="margin">
+                <wp14:pctWidth>0</wp14:pctWidth>
+              </wp14:sizeRelH>
+              <wp14:sizeRelV relativeFrom="margin">
+                <wp14:pctHeight>0</wp14:pctHeight>
+              </wp14:sizeRelV>
+            </wp:anchor>
+          </w:drawing>
+        </mc:Choice>
+        <mc:Fallback>
+          <w:pict>
+            <v:shapetype w14:anchorId="18CDF65E" id="_x0000_t202" coordsize="21600,21600" o:spt="202" path="m,l,21600r21600,l21600,xe">
+              <v:stroke joinstyle="miter"/>
+              <v:path gradientshapeok="t" o:connecttype="rect"/>
+            </v:shapetype>
+            <v:shape id="_x0000_s1031" type="#_x0000_t202" style="position:absolute;left:0;text-align:left;margin-left:295.45pt;margin-top:.05pt;width:175.1pt;height:56pt;z-index:-251646976;visibility:visible;mso-wrap-style:square;mso-width-percent:0;mso-height-percent:0;mso-wrap-distance-left:9pt;mso-wrap-distance-top:3.6pt;mso-wrap-distance-right:9pt;mso-wrap-distance-bottom:3.6pt;mso-position-horizontal:absolute;mso-position-horizontal-relative:text;mso-position-vertical:absolute;mso-position-vertical-relative:text;mso-width-percent:0;mso-height-percent:0;mso-width-relative:margin;mso-height-relative:margin;v-text-anchor:top" o:gfxdata="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" stroked="f">
+              <v:textbox>
+                <w:txbxContent>
+                  <w:p>
+                    <w:pPr>
+                      <w:jc w:val="left"/>
+                      <w:rPr>
+                        <w:color w:val="0F4761" w:themeColor="accent1" w:themeShade="BF"/>
+                        <w:sz w:val="12"/>
+                        <w:szCs w:val="12"/>
+                      </w:rPr>
+                    </w:pPr>
+                    <w:r>
+                      <w:rPr>
+                        <w:color w:val="0F4761" w:themeColor="accent1" w:themeShade="BF"/>
+                        <w:sz w:val="12"/>
+                        <w:szCs w:val="12"/>
+                      </w:rPr>
+                      <w:t xml:space="preserve">PROYECTO DE URBANIZACIÓN</w:t>
+                    </w:r>
+                  </w:p>
+                  <w:p>
+                    <w:pPr>
+                      <w:jc w:val="left"/>
+                      <w:rPr>
+                        <w:color w:val="0F4761" w:themeColor="accent1" w:themeShade="BF"/>
+                        <w:sz w:val="12"/>
+                        <w:szCs w:val="12"/>
+                      </w:rPr>
+                    </w:pPr>
+                    <w:r>
+                      <w:rPr>
+                        <w:color w:val="0F4761" w:themeColor="accent1" w:themeShade="BF"/>
+                        <w:sz w:val="12"/>
+                        <w:szCs w:val="12"/>
+                      </w:rPr>
+                      <w:t xml:space="preserve">Proyecto de urbanización - Ampliación Plaza Mayor</w:t>
+                    </w:r>
+                  </w:p>
+                  <w:p>
+                    <w:pPr>
+                      <w:jc w:val="left"/>
+                      <w:rPr>
+                        <w:color w:val="0F4761" w:themeColor="accent1" w:themeShade="BF"/>
+                        <w:sz w:val="12"/>
+                        <w:szCs w:val="12"/>
+                      </w:rPr>
+                    </w:pPr>
+                    <w:r>
+                      <w:rPr>
+                        <w:b/>
+                        <w:bCs/>
+                        <w:caps/>
+                        <w:sz w:val="12"/>
+                        <w:szCs w:val="12"/>
+                      </w:rPr>
+                      <w:t xml:space="preserve">DEL PGOU DE Málaga</w:t>
+                    </w:r>
+                  </w:p>
+                  <w:p>
+                    <w:pPr>
+                      <w:jc w:val="left"/>
+                      <w:rPr>
+                        <w:b/>
+                        <w:bCs/>
+                        <w:caps/>
+                        <w:sz w:val="12"/>
+                        <w:szCs w:val="12"/>
+                      </w:rPr>
+                    </w:pPr>
+                  </w:p>
+                  <w:p>
+                    <w:pPr>
+                      <w:jc w:val="left"/>
+                      <w:rPr>
+                        <w:b/>
+                        <w:caps/>
+                        <w:color w:val="80340D" w:themeColor="accent2" w:themeShade="80"/>
+                        <w:sz w:val="12"/>
+                        <w:szCs w:val="12"/>
+                      </w:rPr>
+                    </w:pPr>
+                    <w:r>
+                      <w:rPr>
+                        <w:color w:val="80340D" w:themeColor="accent2" w:themeShade="80"/>
+                        <w:sz w:val="12"/>
+                        <w:szCs w:val="12"/>
+                      </w:rPr>
+                      <w:t xml:space="preserve">ANEJO 1. REPORTAJE FOTOGRÁFICO</w:t>
+                    </w:r>
+                  </w:p>
+                  <w:p>
+                    <w:pPr>
+                      <w:jc w:val="left"/>
+                      <w:rPr>
+                        <w:bCs/>
+                        <w:color w:val="auto"/>
+                        <w:sz w:val="14"/>
+                        <w:szCs w:val="14"/>
+                      </w:rPr>
+                    </w:pPr>
+                  </w:p>
+                  <w:p>
+                    <w:pPr>
+                      <w:rPr>
+                        <w:rFonts w:asciiTheme="minorHAnsi" w:hAnsiTheme="minorHAnsi"/>
+                        <w:sz w:val="22"/>
+                        <w:szCs w:val="22"/>
+                      </w:rPr>
+                    </w:pPr>
+                  </w:p>
+                </w:txbxContent>
+              </v:textbox>
+            </v:shape>
+          </w:pict>
+        </mc:Fallback>
+      </mc:AlternateContent>
+    </w:r>
+    <w:r>
       <w:drawing>
-        <wp:inline distT="0" distB="0" distL="0" distR="0" wp14:anchorId="536F9C80" wp14:editId="7BD3C0A0">
-          <wp:extent cx="1085850" cy="476250"/>
+        <wp:inline distT="0" distB="0" distL="0" distR="0" wp14:anchorId="02CD16FD" wp14:editId="10F78A9B">
+          <wp:extent cx="1619250" cy="704850"/>
           <wp:effectExtent l="0" t="0" r="0" b="0"/>
-          <wp:docPr id="89669393" name="LogoEDP" descr="Logotipo EDP" title="Logo EDP"/>
+          <wp:docPr id="390843045" name="Imagen 11" descr="Macintosh HD:Users:Fani:Documents:CLIENTES:edp:marca edp hoja.jpg"/>
           <wp:cNvGraphicFramePr>
             <a:graphicFrameLocks xmlns:a="http://schemas.openxmlformats.org/drawingml/2006/main" noChangeAspect="1"/>
           </wp:cNvGraphicFramePr>
@@ -4426,13 +3165,19 @@
             <a:graphicData uri="http://schemas.openxmlformats.org/drawingml/2006/picture">
               <pic:pic xmlns:pic="http://schemas.openxmlformats.org/drawingml/2006/picture">
                 <pic:nvPicPr>
-                  <pic:cNvPr id="0" name=""/>
+                  <pic:cNvPr id="0" name="Imagen 1867514726" descr="Macintosh HD:Users:Fani:Documents:CLIENTES:edp:marca edp hoja.jpg"/>
                   <pic:cNvPicPr>
                     <a:picLocks noChangeAspect="1" noChangeArrowheads="1"/>
                   </pic:cNvPicPr>
                 </pic:nvPicPr>
                 <pic:blipFill>
-                  <a:blip r:embed="rId1"/>
+                  <a:blip r:embed="rId1">
+                    <a:extLst>
+                      <a:ext uri="{28A0092B-C50C-407E-A947-70E740481C1C}">
+                        <a14:useLocalDpi xmlns:a14="http://schemas.microsoft.com/office/drawing/2010/main" val="0"/>
+                      </a:ext>
+                    </a:extLst>
+                  </a:blip>
                   <a:srcRect/>
                   <a:stretch>
                     <a:fillRect/>
@@ -4441,11 +3186,15 @@
                 <pic:spPr bwMode="auto">
                   <a:xfrm>
                     <a:off x="0" y="0"/>
-                    <a:ext cx="1085850" cy="476250"/>
+                    <a:ext cx="1619250" cy="704850"/>
                   </a:xfrm>
                   <a:prstGeom prst="rect">
                     <a:avLst/>
                   </a:prstGeom>
+                  <a:noFill/>
+                  <a:ln>
+                    <a:noFill/>
+                  </a:ln>
                 </pic:spPr>
               </pic:pic>
             </a:graphicData>
@@ -4453,31 +3202,13 @@
         </wp:inline>
       </w:drawing>
     </w:r>
-    <w:r>
-      <w:rPr>
-        <w:color w:val="366092"/>
-        <w:sz w:val="12"/>
-        <w:szCs w:val="12"/>
-      </w:rPr>
-      <w:tab/>
-      <w:t>535.2.2 – MEJORA CARRETERA GUADALMAR – POU 2026</w:t>
-    </w:r>
-    <w:r>
-      <w:rPr>
-        <w:color w:val="366092"/>
-        <w:sz w:val="12"/>
-        <w:szCs w:val="12"/>
-      </w:rPr>
-      <w:br/>
-      <w:t>Anejo n.º XX.– [TÍTULO DEL ANEJO]</w:t>
-    </w:r>
   </w:p>
   <w:p>
     <w:pPr>
-      <w:pBdr>
-        <w:bottom w:val="single" w:sz="6" w:space="1" w:color="366092"/>
-      </w:pBdr>
-      <w:spacing w:before="40"/>
+      <w:tabs>
+        <w:tab w:val="right" w:pos="8647"/>
+      </w:tabs>
+      <w:ind w:right="-397"/>
     </w:pPr>
   </w:p>
 </w:hdr>

</xml_diff>